<commit_message>
journal v5_ko: apply review edits for real (previous v5 commit contained unedited copy)
Co-Authored-By: Claude Fable 5.1 <noreply@anthropic.com>
Claude-Session: https://claude.ai/code/session_01SvckvZxt3hAXTDPnm8YPEC
</commit_message>
<xml_diff>
--- a/journal/manuscript_v5_ko.docx
+++ b/journal/manuscript_v5_ko.docx
@@ -133,7 +133,7 @@
         <w:t xml:space="preserve"> </w:t>
       </w:r>
       <w:r>
-        <w:t xml:space="preserve">로 조작화한다. 즉 접합·인터커넥트(H01L24)로 분류된 출원이 제조공정 기술(H01L21)도 함께 청구하는가를 본다. 출원의 거의 3분의 2가 그러하다. 이항·다항 로짓 추정 결과, 기술범위가 경계 넘기의 가장 강한 상관요인이며(CPC 서브클래스 1개당 승산비 1.27), 순수 전공정 청구는 시간이 갈수록 줄었으나 통합형 청구는 비중을 유지했고, 출원청이 중요하였다. 중국 출원청 출원은 뚜렷하게 공정 지향적인 반면, 일본 출원청 출원은 거의 공정 단독형을 취하지 않는다. 이 결과는 융합 이론을 산업 내·공정단계 간 사례로 확장하고, 특허 수준의 메커니즘을 반도체 가치사슬의 아키텍처와 연결하며, 다른 공정기술에서 경계 넘기를 탐지할 수 있는 재현 가능한 공동분류 설계를 제공한다.</w:t>
+        <w:t xml:space="preserve">로 조작화한다. 즉 접합·인터커넥트(H01L24)와 제조공정(H01L21)을 한 발명 안에서 함께 청구하는 통합형 특허를 경계를 넘는 특허로 정의하고, 이를 조립 단독형·공정 단독형과 구분한다. 통합형은 출원의 45.8%로 최빈 유형이며, 전공정 기술을 청구하는 출원은 63.6%에 이른다. 다항·이항 로짓 추정 결과, 기술범위가 경계 넘기의 가장 강한 상관요인이며(CPC 서브클래스 1개당 통합형 상대위험비 1.40, 전공정 청구 승산비 1.27), 순수 전공정 청구는 시간이 갈수록 줄었으나 통합형 청구는 비중을 유지했고, 출원청이 중요하였다. 중국 출원청 출원은 뚜렷하게 공정 지향적인 반면, 일본 출원청 출원은 거의 공정 단독형을 취하지 않는다. 이 결과는 융합 이론을 산업 내·공정단계 간 사례로 확장하고, 특허 수준의 메커니즘을 반도체 가치사슬의 아키텍처와 연결하며, 다른 공정기술에서 경계 넘기를 탐지할 수 있는 재현 가능한 공동분류 설계를 제공한다.</w:t>
       </w:r>
     </w:p>
     <w:p>
@@ -214,7 +214,7 @@
         <w:t xml:space="preserve">boundary spanning</w:t>
       </w:r>
       <w:r>
-        <w:t xml:space="preserve">: whether an application classified under bonding and interconnect (H01L24) also claims fabrication-process technology (H01L21). Nearly two-thirds of applications do so. Binary and multinomial logit estimates show that technological scope is the strongest correlate of boundary spanning (odds ratio 1.27 per additional CPC subclass), that pure front-end claiming has declined over time while integrated claiming has held its share, and that filing office matters: applications at the Chinese office are markedly more process-oriented, whereas those at the Japanese office almost never take a process-only form. The results extend convergence theory to the intra-industry, cross-stage case, connect the patent-level mechanism to the architecture of the semiconductor value chain, and offer a reproducible co-classification design for detecting boundary spanning in other process technologies.</w:t>
+        <w:t xml:space="preserve">: an integrated application that claims fabrication-process technology (H01L21) together with bonding and interconnect (H01L24), as distinct from assembly-only and process-only applications. Integrated applications are the modal type (45.8%), and 63.6% of applications claim front-end technology. Multinomial and binary logit estimates show that technological scope is the strongest correlate of boundary spanning (relative-risk ratio 1.40 for the integrated type and odds ratio 1.27 for any front-end claim, per additional CPC subclass), that pure front-end claiming has declined over time while integrated claiming has held its share, and that filing office matters: applications at the Chinese office are markedly more process-oriented, whereas those at the Japanese office almost never take a process-only form. The results extend convergence theory to the intra-industry, cross-stage case, connect the patent-level mechanism to the architecture of the semiconductor value chain, and offer a reproducible co-classification design for detecting boundary spanning in other process technologies.</w:t>
       </w:r>
     </w:p>
     <w:p>
@@ -377,15 +377,15 @@
         <w:t xml:space="preserve"> </w:t>
       </w:r>
       <w:r>
-        <w:t xml:space="preserve">를 접합·인터커넥트(CPC H01L24)로 분류되면서 동시에 제조공정 기술(CPC H01L21)을 청구하는 특허로 정의한다. 공동분류(co-classification)는 융합을 포착하는 표준적인 특허 기반 신호이며(Curran and Leker, 2011; Preschitschek et al., 2013; Kwon et al., 2020), 본 연구의 새로움은 이를 두 산업 사이가 아니라 한 산업을 관통하는 경계에 적용한다는 데 있다. 이에 따라 세 가지 연구질문을 설정한다. 첫째, 경계 넘기는 얼마나 보편적이며 기술이 성숙함에 따라 그 형태는 어떻게 변하였는가? 둘째, 기술범위, 출원 시점, 출원청 등 특허의 어떤 속성이 경계 넘기와 연관되는가? 셋째, 이러한 패턴은 각 출원청(관할권)에서 드러나는 출원·보호 전략과 어떻게 관련되는가?</w:t>
-      </w:r>
-    </w:p>
-    <w:p>
-      <w:pPr>
-        <w:pStyle w:val="BodyText"/>
-      </w:pPr>
-      <w:r>
-        <w:t xml:space="preserve">분석 결과는 세 가지로 요약된다. 첫째, 경계 넘기는 주변적 현상이 아니다. 출원의 63.6%가 적어도 하나의 전공정 기호를 보유하며, 최빈 전략은 두 단계를 결합한</w:t>
+        <w:t xml:space="preserve">를 접합·인터커넥트(CPC H01L24)와 제조공정 기술(CPC H01L21)을 하나의 발명 안에서 함께 청구하는 통합형 특허로 정의하고, 접합만 청구하는 조립 단독형 및 제조공정만 청구하는 공정 단독형과 구분한다. 공동분류(co-classification)는 융합을 포착하는 표준적인 특허 기반 신호이며(Curran and Leker, 2011; Preschitschek et al., 2013; Kwon et al., 2020), 본 연구의 새로움은 이를 두 산업 사이가 아니라 한 산업을 관통하는 경계에 적용한다는 데 있다. 이에 따라 세 가지 연구질문을 설정한다. 첫째, 경계 넘기는 얼마나 보편적이며 기술이 성숙함에 따라 그 형태는 어떻게 변하였는가? 둘째, 기술범위, 출원 시점, 출원청 등 특허의 어떤 속성이 경계 넘기와 연관되는가? 셋째, 이러한 패턴은 각 출원청(관할권)에서 드러나는 출원·보호 전략과 어떻게 관련되는가?</w:t>
+      </w:r>
+    </w:p>
+    <w:p>
+      <w:pPr>
+        <w:pStyle w:val="BodyText"/>
+      </w:pPr>
+      <w:r>
+        <w:t xml:space="preserve">분석 결과는 세 가지로 요약된다. 첫째, 경계 넘기는 주변적 현상이 아니다. 두 단계를 결합한</w:t>
       </w:r>
       <w:r>
         <w:t xml:space="preserve"> </w:t>
@@ -401,7 +401,7 @@
         <w:t xml:space="preserve"> </w:t>
       </w:r>
       <w:r>
-        <w:t xml:space="preserve">청구다. 둘째, 기술범위가 가장 강력한 상관요인이다. 특허가 걸치는 CPC 서브클래스가 하나 늘 때마다 제조공정 기술을 청구할 승산이 약 27% 높아지고, 다항 명세는 넓은 특허가 통합형으로, 좁은 특허가 특화형으로 이동함을 보인다. 시간이 갈수록</w:t>
+        <w:t xml:space="preserve">청구가 출원의 45.8%로 최빈 유형이며, 전공정 기술을 청구하는 출원은 63.6%에 이른다. 둘째, 기술범위가 가장 강력한 상관요인이다. 특허가 걸치는 CPC 서브클래스가 하나 늘 때마다 통합형이 될 상대위험이 약 40% 높아지고(전공정 청구 승산은 약 27%), 넓은 특허는 통합형으로, 좁은 특허는 한 단계 특화형으로 이동한다. 시간이 갈수록</w:t>
       </w:r>
       <w:r>
         <w:t xml:space="preserve"> </w:t>
@@ -706,6 +706,62 @@
         <w:t xml:space="preserve">에 의존한다는 점을 인식할 때 분명해진다. Ernst(2005)는 칩 설계의 수직 전문화가 의존하는 모듈성이 복잡성이 커지면서 한계를 갖는다는 것을 보였다. Jacobides et al.(2006)은 누가 무엇을 하고 가치가 어떻게 배분되는지를 정의하는 템플릿인 산업 아키텍처가 그 자체로 경쟁의 대상이며, 단계 간 상호의존을 바꾸는 혁신은 그 재협상을 불러온다고 주장하였다. 하이브리드 본딩이 바로 그러한 혁신이다. 수율이 웨이퍼 수준 평탄화, 표면 화학, 정렬 등 전공정에 자리한 역량에 달려 있으므로 제조와 패키징 사이의 인터페이스는 더 이상 안정적이지 않다. 그 결과는 두 산업 사이가 아니라 한 산업의 두 단계 사이에서 일어나는 융합이다. 후공정 기업은 전공정 역량을 획득해야 하고, 전공정 기업은 자신의 역량이 패키징으로 자연스럽게 확장됨을 발견한다. 이는 무어의 법칙 종언에 관한 문헌이 일반적 수준에서 예견하고(Arden et al., 2010; Iyer, 2016; Khan et al., 2018) 패키징 공학 문헌이 기술적으로 기술해 온 현상이다(Lau, 2021, 2022). 그러나 이를 발명의 기록 속에서 관찰하는 방법은 제시되지 않았다.</w:t>
       </w:r>
     </w:p>
+    <w:p>
+      <w:pPr>
+        <w:pStyle w:val="BodyText"/>
+      </w:pPr>
+      <w:r>
+        <w:t xml:space="preserve">여기서 본 연구가 말하는 융합과 수직통합 문헌이 다루는 통합의 차이를 분명히 해 둘 필요가 있다. 수직통합 문헌(Macher and Mowery, 2004; Kapoor, 2013)의 분석 단위는</w:t>
+      </w:r>
+      <w:r>
+        <w:t xml:space="preserve"> </w:t>
+      </w:r>
+      <w:r>
+        <w:rPr>
+          <w:i/>
+          <w:iCs/>
+        </w:rPr>
+        <w:t xml:space="preserve">조직 경계</w:t>
+      </w:r>
+      <w:r>
+        <w:t xml:space="preserve"> </w:t>
+      </w:r>
+      <w:r>
+        <w:t xml:space="preserve">로, 어느 기업이 어느 단계를 직접 수행하는가를 묻는다. 반면 융합 문헌의 분석 단위는</w:t>
+      </w:r>
+      <w:r>
+        <w:t xml:space="preserve"> </w:t>
+      </w:r>
+      <w:r>
+        <w:rPr>
+          <w:i/>
+          <w:iCs/>
+        </w:rPr>
+        <w:t xml:space="preserve">지식·기술 기반</w:t>
+      </w:r>
+      <w:r>
+        <w:t xml:space="preserve"> </w:t>
+      </w:r>
+      <w:r>
+        <w:t xml:space="preserve">으로, 서로 다른 영역의 기술이 하나의 발명 안에서 결합되는가를 묻는다(Kodama, 1992; Curran and Leker, 2011). Hacklin et al.(2009)의 단계 모형에서 기술 융합은 산업 융합에 선행한다. 즉 지식 기반이 먼저 중첩되고, 그 위에서 조직 경계가 재편된다. 본 연구가 특허 청구항에서 관찰하는 것은 이 선행 단계, 즉 파운드리가 패키징을 내재화하는 조직적 결정 이전 또는 이면에서 진행되는</w:t>
+      </w:r>
+      <w:r>
+        <w:t xml:space="preserve"> </w:t>
+      </w:r>
+      <w:r>
+        <w:rPr>
+          <w:i/>
+          <w:iCs/>
+        </w:rPr>
+        <w:t xml:space="preserve">기술적</w:t>
+      </w:r>
+      <w:r>
+        <w:t xml:space="preserve"> </w:t>
+      </w:r>
+      <w:r>
+        <w:t xml:space="preserve">수렴이다. Kapoor와 Adner(2012)가 생산 경계보다 넓은 지식 경계의 우위를 논한 것과 연결하면, 경계를 넘는 특허는 지식 경계가 공정 단계를 넘어 확장되었음을 보여주는 직접적 증거이며, 수직통합 문헌이 결과로 관찰하는 조직적 통합의 기술적 전제 조건을 측정하는 셈이다.</w:t>
+      </w:r>
+    </w:p>
     <w:bookmarkEnd w:id="13"/>
     <w:bookmarkStart w:id="14" w:name="특허로-융합-측정하기-분야-수준-지수에서-경계를-넘는-특허로"/>
     <w:p>
@@ -777,7 +833,7 @@
         <w:pStyle w:val="BodyText"/>
       </w:pPr>
       <w:r>
-        <w:t xml:space="preserve">본 연구는 공동분류를 신호로 택한다는 점에서 첫째 전통에 속하지만 분석 단위에서 이와 구별된다. 공동분류를 분야 수준 지수로 집계하는 대신, 후공정 접합 클래스(H01L24)로 분류된 발명이 전공정 제조 기호(H01L21)도 보유하는지를 각 특허의 이항 속성으로 정의하고, 이러한 특허를</w:t>
+        <w:t xml:space="preserve">본 연구는 공동분류를 신호로 택한다는 점에서 첫째 전통에 속하지만 분석 단위에서 이와 구별된다. 공동분류를 분야 수준 지수로 집계하는 대신, 각 특허를 후공정 접합 기호(H01L24)만 보유하는 조립 단독형, 전공정 제조 기호(H01L21)만 보유하는 공정 단독형, 그리고 둘을 함께 보유하는 통합형으로 구분하고, 통합형을</w:t>
       </w:r>
       <w:r>
         <w:t xml:space="preserve"> </w:t>
@@ -793,7 +849,23 @@
         <w:t xml:space="preserve"> </w:t>
       </w:r>
       <w:r>
-        <w:t xml:space="preserve">라 부른다. 이 속성은 발명 수준의 융합으로 직접 해석되고, 표준 이산선택 추정량으로 모형화할 수 있으며, 분야 수준 지수가 평균해 버리는 특허 간 이질성을 보존한다.</w:t>
+        <w:t xml:space="preserve">라 부른다. 이 구분은 발명 수준의 융합으로 직접 해석되고, 표준 이산선택 추정량으로 모형화할 수 있으며, 분야 수준 지수가 평균해 버리는 특허 간 이질성을 보존한다. 통합형과 공정 단독형을 합한 집합, 즉 전공정 기호를 하나라도 보유하는 특허는</w:t>
+      </w:r>
+      <w:r>
+        <w:t xml:space="preserve"> </w:t>
+      </w:r>
+      <w:r>
+        <w:rPr>
+          <w:i/>
+          <w:iCs/>
+        </w:rPr>
+        <w:t xml:space="preserve">전공정 지향(front-end orientation)</w:t>
+      </w:r>
+      <w:r>
+        <w:t xml:space="preserve"> </w:t>
+      </w:r>
+      <w:r>
+        <w:t xml:space="preserve">으로 따로 명명하여 경계 넘기와 구별한다.</w:t>
       </w:r>
     </w:p>
     <w:p>
@@ -869,7 +941,7 @@
         <w:t xml:space="preserve"> </w:t>
       </w:r>
       <w:r>
-        <w:t xml:space="preserve">Kodama(1992)의 융합과 Rosenberg(1963)의 수렴은 모두 하나 이상의 영역에서 온 지식을 결합하는 발명을 기술한다. 경계 넘기가 융합의 한 형태라면, 더 많은 기술 클래스에 걸치는 특허가 그중에 전공정 클래스를 포함할 가능성이 더 높아야 한다. 이 메커니즘은 클래스가 많을수록 그중 하나가 H01L21일 가능성이 커진다는 점에서 부분적으로 기계적이지만, 동시에 전략적이기도 하다. 웨이퍼 준비에서 접합된 적층까지 전체 공정 흐름을 청구하는 특허는 필연적으로 제조에 닿는 반면, 조립 단계나 접합 구조만 청구하는 특허는 그렇지 않다(Lerner, 1994; Ziedonis, 2004).</w:t>
+        <w:t xml:space="preserve">Kodama(1992)의 융합과 Rosenberg(1963)의 수렴은 모두 하나 이상의 영역에서 온 지식을 결합하는 발명을 기술한다. 경계 넘기가 융합의 한 형태라면, 더 많은 기술 클래스에 걸치는 특허가 접합 클래스와 전공정 클래스를 함께 포함하는 통합형일 가능성이 더 높아야 한다. 이 메커니즘은 클래스가 많을수록 그중 하나가 H01L21일 가능성이 커진다는 점에서 부분적으로 기계적이지만, 동시에 전략적이기도 하다. 웨이퍼 준비에서 접합된 적층까지 전체 공정 흐름을 청구하는 특허는 필연적으로 제조에 닿는 반면, 조립 단계나 접합 구조만 청구하는 특허는 그렇지 않다(Lerner, 1994; Ziedonis, 2004).</w:t>
       </w:r>
     </w:p>
     <w:p>
@@ -887,7 +959,7 @@
         <w:t xml:space="preserve"> </w:t>
       </w:r>
       <w:r>
-        <w:t xml:space="preserve">하이브리드 본딩 특허의 기술범위가 넓을수록 전/후공정 경계를 넘을, 즉 접합(H01L24) 기술에 더하여 제조공정(H01L21) 기술을 청구할 가능성이 높다.</w:t>
+        <w:t xml:space="preserve">하이브리드 본딩 특허의 기술범위가 넓을수록 전/후공정 경계를 넘을, 즉 접합(H01L24) 기술과 제조공정(H01L21) 기술을 하나의 발명 안에서 함께 청구하는 통합형일 가능성이 높다.</w:t>
       </w:r>
     </w:p>
     <w:p>
@@ -1512,77 +1584,109 @@
           <w:i/>
           <w:iCs/>
         </w:rPr>
+        <w:t xml:space="preserve">Tech_cat</w:t>
+      </w:r>
+      <w:r>
+        <w:t xml:space="preserve"> </w:t>
+      </w:r>
+      <w:r>
+        <w:t xml:space="preserve">은 각 출원을 상호배타적인 세 전략 유형, 즉</w:t>
+      </w:r>
+      <w:r>
+        <w:t xml:space="preserve"> </w:t>
+      </w:r>
+      <w:r>
+        <w:rPr>
+          <w:i/>
+          <w:iCs/>
+        </w:rPr>
+        <w:t xml:space="preserve">조립 단독형(assembly-only)</w:t>
+      </w:r>
+      <w:r>
+        <w:t xml:space="preserve"> </w:t>
+      </w:r>
+      <w:r>
+        <w:t xml:space="preserve">(H01L24 기호만),</w:t>
+      </w:r>
+      <w:r>
+        <w:t xml:space="preserve"> </w:t>
+      </w:r>
+      <w:r>
+        <w:rPr>
+          <w:i/>
+          <w:iCs/>
+        </w:rPr>
+        <w:t xml:space="preserve">통합형(integrated)</w:t>
+      </w:r>
+      <w:r>
+        <w:t xml:space="preserve"> </w:t>
+      </w:r>
+      <w:r>
+        <w:t xml:space="preserve">(H01L24와 H01L21 모두),</w:t>
+      </w:r>
+      <w:r>
+        <w:t xml:space="preserve"> </w:t>
+      </w:r>
+      <w:r>
+        <w:rPr>
+          <w:i/>
+          <w:iCs/>
+        </w:rPr>
+        <w:t xml:space="preserve">공정 단독형(process-only)</w:t>
+      </w:r>
+      <w:r>
+        <w:t xml:space="preserve"> </w:t>
+      </w:r>
+      <w:r>
+        <w:t xml:space="preserve">(H01L21 기호만)에 배정하며, 통합형이 경계 넘기의 측정치다.</w:t>
+      </w:r>
+      <w:r>
+        <w:t xml:space="preserve"> </w:t>
+      </w:r>
+      <w:r>
+        <w:rPr>
+          <w:i/>
+          <w:iCs/>
+        </w:rPr>
         <w:t xml:space="preserve">Has_process</w:t>
       </w:r>
       <w:r>
         <w:t xml:space="preserve"> </w:t>
       </w:r>
       <w:r>
-        <w:t xml:space="preserve">는 출원이 H01L21 기호를 하나라도 보유하면 1인 이항 지표로, 경계 넘기의 측정치다.</w:t>
-      </w:r>
-      <w:r>
-        <w:t xml:space="preserve"> </w:t>
-      </w:r>
-      <w:r>
-        <w:rPr>
-          <w:i/>
-          <w:iCs/>
-        </w:rPr>
-        <w:t xml:space="preserve">Tech_cat</w:t>
-      </w:r>
-      <w:r>
-        <w:t xml:space="preserve"> </w:t>
-      </w:r>
-      <w:r>
-        <w:t xml:space="preserve">은 각 출원을 상호배타적인 세 전략 유형, 즉</w:t>
-      </w:r>
-      <w:r>
-        <w:t xml:space="preserve"> </w:t>
-      </w:r>
-      <w:r>
-        <w:rPr>
-          <w:i/>
-          <w:iCs/>
-        </w:rPr>
-        <w:t xml:space="preserve">조립 단독형(assembly-only)</w:t>
-      </w:r>
-      <w:r>
-        <w:t xml:space="preserve"> </w:t>
-      </w:r>
-      <w:r>
-        <w:t xml:space="preserve">(H01L24 기호만),</w:t>
-      </w:r>
-      <w:r>
-        <w:t xml:space="preserve"> </w:t>
-      </w:r>
-      <w:r>
-        <w:rPr>
-          <w:i/>
-          <w:iCs/>
-        </w:rPr>
-        <w:t xml:space="preserve">통합형(integrated)</w:t>
-      </w:r>
-      <w:r>
-        <w:t xml:space="preserve"> </w:t>
-      </w:r>
-      <w:r>
-        <w:t xml:space="preserve">(H01L24와 H01L21 모두),</w:t>
-      </w:r>
-      <w:r>
-        <w:t xml:space="preserve"> </w:t>
-      </w:r>
-      <w:r>
-        <w:rPr>
-          <w:i/>
-          <w:iCs/>
-        </w:rPr>
-        <w:t xml:space="preserve">공정 단독형(process-only)</w:t>
-      </w:r>
-      <w:r>
-        <w:t xml:space="preserve"> </w:t>
-      </w:r>
-      <w:r>
-        <w:t xml:space="preserve">(H01L21 기호만)에 배정한다.</w:t>
+        <w:t xml:space="preserve">는 출원이 H01L21 기호를 하나라도 보유하면 1인 이항 지표로, 통합형과 공정 단독형을 합한 전공정 지향의 측정치다. 두 변수는 역할이 다르다. 경계 넘기의 본 검정은</w:t>
+      </w:r>
+      <w:r>
+        <w:t xml:space="preserve"> </w:t>
+      </w:r>
+      <w:r>
+        <w:rPr>
+          <w:i/>
+          <w:iCs/>
+        </w:rPr>
+        <w:t xml:space="preserve">tech_cat</w:t>
+      </w:r>
+      <w:r>
+        <w:t xml:space="preserve"> </w:t>
+      </w:r>
+      <w:r>
+        <w:t xml:space="preserve">의 통합형 갈래이며,</w:t>
+      </w:r>
+      <w:r>
+        <w:t xml:space="preserve"> </w:t>
+      </w:r>
+      <w:r>
+        <w:rPr>
+          <w:i/>
+          <w:iCs/>
+        </w:rPr>
+        <w:t xml:space="preserve">has_process</w:t>
+      </w:r>
+      <w:r>
+        <w:t xml:space="preserve"> </w:t>
+      </w:r>
+      <w:r>
+        <w:t xml:space="preserve">는 전공정 기술이 청구되는지 여부만을 묻는 보조 지표다.</w:t>
       </w:r>
       <w:r>
         <w:t xml:space="preserve"> </w:t>
@@ -1728,29 +1832,29 @@
               <w:pStyle w:val="Compact"/>
             </w:pPr>
             <w:r>
-              <w:t xml:space="preserve">has_process</w:t>
-            </w:r>
-          </w:p>
-        </w:tc>
-        <w:tc>
-          <w:tcPr/>
-          <w:p>
-            <w:pPr>
-              <w:pStyle w:val="Compact"/>
-            </w:pPr>
-            <w:r>
-              <w:t xml:space="preserve">H01L21(제조공정) 기호를 하나라도 보유하면 1, 아니면 0</w:t>
-            </w:r>
-          </w:p>
-        </w:tc>
-        <w:tc>
-          <w:tcPr/>
-          <w:p>
-            <w:pPr>
-              <w:pStyle w:val="Compact"/>
-            </w:pPr>
-            <w:r>
-              <w:t xml:space="preserve">이항</w:t>
+              <w:t xml:space="preserve">tech_cat</w:t>
+            </w:r>
+          </w:p>
+        </w:tc>
+        <w:tc>
+          <w:tcPr/>
+          <w:p>
+            <w:pPr>
+              <w:pStyle w:val="Compact"/>
+            </w:pPr>
+            <w:r>
+              <w:t xml:space="preserve">조립 단독형(H01L24만) / 통합형(둘 다 = 경계 넘기) / 공정 단독형(H01L21만)</w:t>
+            </w:r>
+          </w:p>
+        </w:tc>
+        <w:tc>
+          <w:tcPr/>
+          <w:p>
+            <w:pPr>
+              <w:pStyle w:val="Compact"/>
+            </w:pPr>
+            <w:r>
+              <w:t xml:space="preserve">범주, 3</w:t>
             </w:r>
           </w:p>
         </w:tc>
@@ -1763,29 +1867,29 @@
               <w:pStyle w:val="Compact"/>
             </w:pPr>
             <w:r>
-              <w:t xml:space="preserve">tech_cat</w:t>
-            </w:r>
-          </w:p>
-        </w:tc>
-        <w:tc>
-          <w:tcPr/>
-          <w:p>
-            <w:pPr>
-              <w:pStyle w:val="Compact"/>
-            </w:pPr>
-            <w:r>
-              <w:t xml:space="preserve">조립 단독형(H01L24만) / 통합형(둘 다) / 공정 단독형(H01L21만)</w:t>
-            </w:r>
-          </w:p>
-        </w:tc>
-        <w:tc>
-          <w:tcPr/>
-          <w:p>
-            <w:pPr>
-              <w:pStyle w:val="Compact"/>
-            </w:pPr>
-            <w:r>
-              <w:t xml:space="preserve">범주, 3</w:t>
+              <w:t xml:space="preserve">has_process</w:t>
+            </w:r>
+          </w:p>
+        </w:tc>
+        <w:tc>
+          <w:tcPr/>
+          <w:p>
+            <w:pPr>
+              <w:pStyle w:val="Compact"/>
+            </w:pPr>
+            <w:r>
+              <w:t xml:space="preserve">H01L21(제조공정) 기호를 하나라도 보유하면 1(전공정 지향), 아니면 0</w:t>
+            </w:r>
+          </w:p>
+        </w:tc>
+        <w:tc>
+          <w:tcPr/>
+          <w:p>
+            <w:pPr>
+              <w:pStyle w:val="Compact"/>
+            </w:pPr>
+            <w:r>
+              <w:t xml:space="preserve">이항</w:t>
             </w:r>
           </w:p>
         </w:tc>
@@ -1866,7 +1970,7 @@
         <w:pStyle w:val="BodyText"/>
       </w:pPr>
       <w:r>
-        <w:t xml:space="preserve">기술범위는 평균 5.69개 서브클래스(표준편차 4.07, 범위 1–21)다. 미국 출원청이 382건으로 가장 많고, 중국(175), PCT 경로(113), EPO(83), 대만(75), 한국(58), 일본(26), 기타(16)가 뒤를 잇는다. 그림 1은 출원연도 프로필을 보여준다. 2010년 이전에는 활동이 미미하다가 2010년대 후반에 가파르게 상승하여 2022년경 정점에 이르고, 2023–2024년의 하락은 실제 감소가 아니라 최근 출원이 공개되기까지의 시차를 반영한다. 전략 유형별로는 425건(45.8%)이 통합형, 338건(36.4%)이 조립 단독형, 165건(17.8%)이 공정 단독형이며, 합계 590건, 즉 63.6%가 적어도 하나의 제조공정 기호를 보유한다.</w:t>
+        <w:t xml:space="preserve">기술범위는 평균 5.69개 서브클래스(표준편차 4.07, 범위 1–21)다. 미국 출원청이 382건으로 가장 많고, 중국(175), PCT 경로(113), EPO(83), 대만(75), 한국(58), 일본(26), 기타(16)가 뒤를 잇는다. 그림 1은 출원연도 프로필을 보여준다. 2010년 이전에는 활동이 미미하다가 2010년대 후반에 가파르게 상승하여 2022년경 정점에 이르고, 2023–2024년의 하락은 실제 감소가 아니라 최근 출원이 공개되기까지의 시차를 반영한다. 전략 유형별로는 425건(45.8%)이 통합형, 338건(36.4%)이 조립 단독형, 165건(17.8%)이 공정 단독형이다. 경계를 넘는 특허(통합형)가 최빈 유형이며, 통합형과 공정 단독형을 합한 590건(63.6%)이 전공정 지향에 해당한다.</w:t>
       </w:r>
     </w:p>
     <w:p>
@@ -1997,7 +2101,23 @@
         <w:pStyle w:val="BodyText"/>
       </w:pPr>
       <w:r>
-        <w:t xml:space="preserve">경계 넘기는 이산선택으로 모형화한다. 이항 로짓은 기술범위, 연도 추세, 출원청으로</w:t>
+        <w:t xml:space="preserve">전략 유형은 이산선택으로 모형화한다. 다항 로짓(McFadden, 1974)은 조립 단독형을 기준 범주로</w:t>
+      </w:r>
+      <w:r>
+        <w:t xml:space="preserve"> </w:t>
+      </w:r>
+      <w:r>
+        <w:rPr>
+          <w:i/>
+          <w:iCs/>
+        </w:rPr>
+        <w:t xml:space="preserve">tech_cat</w:t>
+      </w:r>
+      <w:r>
+        <w:t xml:space="preserve"> </w:t>
+      </w:r>
+      <w:r>
+        <w:t xml:space="preserve">을 모형화하고 상대위험비(RRR)로 보고하여, 통합형(경계 넘기)과 공정 단독형을 동일한 기준 범주 대비로 해석할 수 있게 한다. 이것이 H1과 H2의 본 검정이다. 이에 앞서 이항 로짓은 기술범위, 연도 추세, 출원청으로</w:t>
       </w:r>
       <w:r>
         <w:t xml:space="preserve"> </w:t>
@@ -2013,23 +2133,7 @@
         <w:t xml:space="preserve"> </w:t>
       </w:r>
       <w:r>
-        <w:t xml:space="preserve">를 예측하며, 승산비(OR)로 보고하고 ROC 곡선 하면적(AUC)으로 평가한다(Hosmer et al., 2013). 이어서 다항 로짓(McFadden, 1974)은 조립 단독형을 기준 범주로</w:t>
-      </w:r>
-      <w:r>
-        <w:t xml:space="preserve"> </w:t>
-      </w:r>
-      <w:r>
-        <w:rPr>
-          <w:i/>
-          <w:iCs/>
-        </w:rPr>
-        <w:t xml:space="preserve">tech_cat</w:t>
-      </w:r>
-      <w:r>
-        <w:t xml:space="preserve"> </w:t>
-      </w:r>
-      <w:r>
-        <w:t xml:space="preserve">을 모형화하고 상대위험비(RRR)로 보고하여, 통합형과 공정 단독형을 동일한 기준 범주 대비로 해석할 수 있게 한다. 다항 로짓은 무관 대안의 독립성(IIA)에 의존하므로, 그 추정치를 기준 범주 대비 상대적 경향으로 해석하고 절대 확률에 관한 인과적 진술은 삼간다. 카운트 모형에서는 로버스트 표준오차를 병행 산출하였으며, 추정치 변화가 미미하여 선형 벤치마크의 문제가 오차 구조가 아니라 함수 형태에 있음을 확인하였다.</w:t>
+        <w:t xml:space="preserve">(전공정 지향)를 예측하며, 승산비(OR)로 보고하고 ROC 곡선 하면적(AUC)으로 평가한다(Hosmer et al., 2013). 이항 로짓은 전공정 기술이 청구되는지만을 묻는 단순한 명세로서 다항 결과의 예비 점검 역할을 한다. 다항 로짓은 무관 대안의 독립성(IIA)에 의존하므로, 그 추정치를 기준 범주 대비 상대적 경향으로 해석하고 절대 확률에 관한 인과적 진술은 삼간다. 카운트 모형에서는 로버스트 표준오차를 병행 산출하였으며, 추정치 변화가 미미하여 선형 벤치마크의 문제가 오차 구조가 아니라 함수 형태에 있음을 확인하였다.</w:t>
       </w:r>
     </w:p>
     <w:bookmarkEnd w:id="23"/>
@@ -2948,13 +3052,13 @@
       </w:r>
     </w:p>
     <w:bookmarkEnd w:id="28"/>
-    <w:bookmarkStart w:id="32" w:name="경계-넘기-이항-로짓"/>
+    <w:bookmarkStart w:id="32" w:name="전공정-지향-이항-로짓"/>
     <w:p>
       <w:pPr>
         <w:pStyle w:val="Heading3"/>
       </w:pPr>
       <w:r>
-        <w:t xml:space="preserve">5.2 경계 넘기: 이항 로짓</w:t>
+        <w:t xml:space="preserve">5.2 전공정 지향: 이항 로짓</w:t>
       </w:r>
     </w:p>
     <w:p>
@@ -2962,10 +3066,7 @@
         <w:pStyle w:val="FirstParagraph"/>
       </w:pPr>
       <w:r>
-        <w:t xml:space="preserve">표 4는</w:t>
-      </w:r>
-      <w:r>
-        <w:t xml:space="preserve"> </w:t>
+        <w:t xml:space="preserve">표 4는 전공정 지향(</w:t>
       </w:r>
       <w:r>
         <w:rPr>
@@ -2975,10 +3076,7 @@
         <w:t xml:space="preserve">has_process</w:t>
       </w:r>
       <w:r>
-        <w:t xml:space="preserve"> </w:t>
-      </w:r>
-      <w:r>
-        <w:t xml:space="preserve">에 대한 이항 로짓을 보고한다. 기술범위가 가장 강력한 예측변수다. CPC 서브클래스가 하나 늘 때마다 특허가 제조공정 기술을 청구할 승산이 약 27% 높아지며(OR 1.267, p &lt; 0.01), 이는 H1을 지지한다. 연도 추세는 반대 방향이다(연간 OR 0.946, p &lt; 0.01). 접합·조립 수준의 발명이 분야의 주류가 되면서 공정 지향 출원의</w:t>
+        <w:t xml:space="preserve">)에 대한 이항 로짓을 보고한다. 기술범위가 가장 강력한 예측변수다. CPC 서브클래스가 하나 늘 때마다 특허가 제조공정 기술을 청구할 승산이 약 27% 높아진다(OR 1.267, p &lt; 0.01). 이 결과는 H1과 방향이 일치하지만, 전공정 지향에는 경계를 넘지 않는 공정 단독형이 포함되므로 H1의 본 검정은 다음 절의 다항 로짓에서 이루어진다. 연도 추세는 반대 방향이다(연간 OR 0.946, p &lt; 0.01). 접합·조립 수준의 발명이 분야의 주류가 되면서 공정 지향 출원의</w:t>
       </w:r>
       <w:r>
         <w:t xml:space="preserve"> </w:t>
@@ -3012,7 +3110,7 @@
         <w:t xml:space="preserve"> </w:t>
       </w:r>
       <w:r>
-        <w:t xml:space="preserve">경계 넘기의 이항 로짓(has_process = H01L21 기호 보유 시 1). 승산비; 괄호 안은 표준오차; * p &lt; 0.10, ** p &lt; 0.05, *** p &lt; 0.01.</w:t>
+        <w:t xml:space="preserve">전공정 지향의 이항 로짓(has_process = H01L21 기호 보유 시 1). 승산비; 괄호 안은 표준오차; * p &lt; 0.10, ** p &lt; 0.05, *** p &lt; 0.01.</w:t>
       </w:r>
     </w:p>
     <w:tbl>
@@ -3488,7 +3586,7 @@
         <w:t xml:space="preserve"> </w:t>
       </w:r>
       <w:r>
-        <w:t xml:space="preserve">경계 넘기 로짓의 ROC 곡선(AUC = 0.707).</w:t>
+        <w:t xml:space="preserve">전공정 지향 로짓의 ROC 곡선(AUC = 0.707).</w:t>
       </w:r>
     </w:p>
     <w:bookmarkEnd w:id="32"/>
@@ -3506,7 +3604,7 @@
         <w:pStyle w:val="FirstParagraph"/>
       </w:pPr>
       <w:r>
-        <w:t xml:space="preserve">이항 모형은 특허가 경계를 넘지 않는 두 가지 방식, 즉 조립에만 머무는 경우와 제조에만 머무는 경우를 구분하지 못한다. 표 5의 다항 로짓은 이를 분리한다. 조립 단독형 대비로 읽으면, 기술범위는 특허를 통합형으로 밀고(RRR 1.403, p &lt; 0.01) 공정 단독형에서 멀어지게 한다(RRR 0.905, p &lt; 0.05). 넓은 특허는 두 단계에 걸치고, 좁은 특허는 한 단계에 특화한다. 이는 H1을 보다 정밀하게 확인한 결과다. 범위는 단순히 전공정 기호의 존재가 아니라 하나의 발명 안에서 전공정과 후공정 청구의</w:t>
+        <w:t xml:space="preserve">이항 모형은 특허가 경계를 넘지 않는 두 가지 방식, 즉 조립에만 머무는 경우와 제조에만 머무는 경우를 구분하지 못한다. 표 5의 다항 로짓은 이를 분리하며, 경계 넘기(통합형)에 대한 본 검정이다. 조립 단독형 대비로 읽으면, 기술범위는 특허를 통합형으로 밀고(RRR 1.403, p &lt; 0.01) 공정 단독형에서 멀어지게 한다(RRR 0.905, p &lt; 0.05). 넓은 특허는 두 단계에 걸치고, 좁은 특허는 한 단계에 특화한다. H1은 지지된다. 범위는 단순히 전공정 기호의 존재가 아니라 하나의 발명 안에서 전공정과 후공정 청구의</w:t>
       </w:r>
       <w:r>
         <w:t xml:space="preserve"> </w:t>
@@ -4308,7 +4406,7 @@
         <w:pStyle w:val="FirstParagraph"/>
       </w:pPr>
       <w:r>
-        <w:t xml:space="preserve">표 6은 가설 검정 결과를 요약한다. H1은 이항·다항 명세 모두에서 지지된다. H2도 지지되어, 공정 단독형 청구는 감소하는 반면 통합형 청구는 비중을 유지한다. H3a는 두 명세 모두에서 지지되고, H3b는 공정 단독형 형태에 대해(강하게) 그리고 기술범위에 대해(10% 수준에서) 지지되며, 이항 로짓의 일본 계수는 기대 방향이지만 부정확하다.</w:t>
+        <w:t xml:space="preserve">표 6은 가설 검정 결과를 요약한다. H1은 다항 로짓의 통합형 갈래에서 지지되며 이항 로짓도 같은 방향이다. H2도 지지되어, 공정 단독형 청구는 감소하는 반면 통합형 청구는 비중을 유지한다. H3a는 두 명세 모두에서 지지되고, H3b는 공정 단독형 형태에 대해(강하게) 그리고 기술범위에 대해(10% 수준에서) 지지되며, 이항 로짓의 일본 계수는 기대 방향이지만 부정확하다.</w:t>
       </w:r>
     </w:p>
     <w:p>
@@ -4410,18 +4508,28 @@
               <w:pStyle w:val="Compact"/>
             </w:pPr>
             <w:r>
-              <w:t xml:space="preserve">범위가 넓을수록 경계 넘기</w:t>
-            </w:r>
-          </w:p>
-        </w:tc>
-        <w:tc>
-          <w:tcPr/>
-          <w:p>
-            <w:pPr>
-              <w:pStyle w:val="Compact"/>
-            </w:pPr>
-            <w:r>
-              <w:t xml:space="preserve">OR 1.267***(표 4); RRR 통합형 1.403***, 공정 단독형 0.905**(표 5)</w:t>
+              <w:t xml:space="preserve">범위가 넓을수록 경계 넘기(통합형)</w:t>
+            </w:r>
+          </w:p>
+        </w:tc>
+        <w:tc>
+          <w:tcPr/>
+          <w:p>
+            <w:pPr>
+              <w:pStyle w:val="Compact"/>
+            </w:pPr>
+            <w:r>
+              <w:rPr>
+                <w:b/>
+                <w:bCs/>
+              </w:rPr>
+              <w:t xml:space="preserve">본 검정:</w:t>
+            </w:r>
+            <w:r>
+              <w:t xml:space="preserve"> </w:t>
+            </w:r>
+            <w:r>
+              <w:t xml:space="preserve">RRR 통합형 1.403***, 공정 단독형 0.905**(표 5); 보조: 전공정 지향 OR 1.267***(표 4)</w:t>
             </w:r>
           </w:p>
         </w:tc>
@@ -4513,7 +4621,7 @@
               <w:pStyle w:val="Compact"/>
             </w:pPr>
             <w:r>
-              <w:t xml:space="preserve">OR 1.650**(표 4); RRR 공정 단독형 2.687***(표 5); 범위 IRR 0.785***(표 3)</w:t>
+              <w:t xml:space="preserve">RRR 공정 단독형 2.687***(표 5); 전공정 지향 OR 1.650**(표 4); 범위 IRR 0.785***(표 3)</w:t>
             </w:r>
           </w:p>
         </w:tc>
@@ -4581,7 +4689,7 @@
         <w:pStyle w:val="BodyText"/>
       </w:pPr>
       <w:r>
-        <w:t xml:space="preserve">결과의 강건성과 관련하여 세 가지를 점검하였다. 첫째, 카운트 모형의 선택이 범위 결과를 좌우하지 않는다. 연도와 중국 출원청 효과의 부호와 유의성은 OLS, 로버스트 OLS, Poisson, 음이항 명세에서 동일하며(표 3), 표준오차가 보정되면서 정밀도를 잃는 것은 일본 출원청 계수뿐이고, 이 때문에 이를 10% 수준에서 보고한다. 둘째, 2023–2024년의 출원 감소는 공개 시차의 인공물이다. 연도 추세가 1968–2024년 전 기간에 걸쳐 추정되고 모형이 연도를 선형으로 통제하므로, 절단은 추정 추세의 방향보다 최근 카운트의 수준에 영향을 미친다. 다만 공정 단독형의 감소를 절단된 연도까지 외삽하지는 않는다. 셋째, 다항 결과는 무관 대안의 독립성 가정에 따라 조립 단독형 기준 대비 상대적 경향으로 읽으며, 그 가정을 요구하지 않는 이항 로짓이 범위·시간·중국 출원청에 대해 같은 질적 결론을 준다.</w:t>
+        <w:t xml:space="preserve">결과의 강건성과 관련하여 세 가지를 점검하였다. 첫째, 카운트 모형의 선택이 범위 결과를 좌우하지 않는다. 연도와 중국 출원청 효과의 부호와 유의성은 OLS, 로버스트 OLS, Poisson, 음이항 명세에서 동일하며(표 3), 표준오차가 보정되면서 정밀도를 잃는 것은 일본 출원청 계수뿐이고, 이 때문에 이를 10% 수준에서 보고한다. 둘째, 2023–2024년의 출원 감소는 공개 시차의 인공물이다. 연도 추세가 1968–2024년 전 기간에 걸쳐 추정되고 모형이 연도를 선형으로 통제하므로, 절단은 추정 추세의 방향보다 최근 카운트의 수준에 영향을 미친다. 다만 공정 단독형의 감소를 절단된 연도까지 외삽하지는 않는다. 셋째, 다항 결과는 무관 대안의 독립성 가정에 따라 조립 단독형 기준 대비 상대적 경향으로 읽으며, 그 가정을 요구하지 않는 이항 로짓이 범위·시간·중국 출원청에 대해 같은 질적 결론을 준다. 넷째, 공정 단독형의 시간적 감소에는 기술 변화 외에 분류 관행의 변화라는 경쟁 설명이 있다. 하이브리드 본딩 전용 인덱싱 코드(예: H01L2224/08145)가 도입·정착되면서 과거에는 H01L21로만 분류되던 접합 발명이 이후에는 H01L24 계열 코드를 함께 받게 되었다면, 공정 단독형의 감소는 발명 내용의 변화가 아니라 분류 체계의 변화를 반영한다. CPC는 기존 문헌에도 소급 적용되므로 이 효과의 방향은 단정하기 어려우나, 본 연구의 자료로는 두 설명을 분리할 수 없다. 재구성 해석은 이 유보 아래 제시한다.</w:t>
       </w:r>
     </w:p>
     <w:bookmarkEnd w:id="37"/>
@@ -4651,7 +4759,39 @@
         <w:t xml:space="preserve"> </w:t>
       </w:r>
       <w:r>
-        <w:t xml:space="preserve">경계에도 적용되며, 그 경계가 개별 발명 수준에서 관찰될 수 있음을 보인다. 하이브리드 본딩 특허의 거의 3분의 2가 전공정 기술을 청구하고, 최빈 특허는 통합형이다. Jacobides et al.(2006)의 견해대로 산업 아키텍처가 분업의 템플릿이라면, 이러한 산업 내 융합은 템플릿이 재협상되는 메커니즘이다. 단계 간 인터페이스가 안정성을 잃으면 발명이 그 양쪽을 모두 청구하기 시작하는 것이다.</w:t>
+        <w:t xml:space="preserve">경계에도 적용되며, 그 경계가 개별 발명 수준에서 관찰될 수 있음을 보인다. 하이브리드 본딩 특허의 최빈 유형은 두 단계를 한 발명 안에 결합한 통합형(45.8%)이며, 전공정 기술을 청구하는 특허는 63.6%에 이른다. Jacobides et al.(2006)의 견해대로 산업 아키텍처가 분업의 템플릿이라면, 이러한 산업 내 융합은 템플릿이 재협상되는 메커니즘이다. 단계 간 인터페이스가 안정성을 잃으면 발명이 그 양쪽을 모두 청구하기 시작하는 것이다. 이 점에서 본 연구의 기여는 수직통합 문헌과 구별된다. Kapoor(2013)가 보인 것은 분업 속에서</w:t>
+      </w:r>
+      <w:r>
+        <w:t xml:space="preserve"> </w:t>
+      </w:r>
+      <w:r>
+        <w:rPr>
+          <w:i/>
+          <w:iCs/>
+        </w:rPr>
+        <w:t xml:space="preserve">조직적</w:t>
+      </w:r>
+      <w:r>
+        <w:t xml:space="preserve"> </w:t>
+      </w:r>
+      <w:r>
+        <w:t xml:space="preserve">통합이 지속되었다는 사실이고, 본 연구가 보인 것은 그 통합의</w:t>
+      </w:r>
+      <w:r>
+        <w:t xml:space="preserve"> </w:t>
+      </w:r>
+      <w:r>
+        <w:rPr>
+          <w:i/>
+          <w:iCs/>
+        </w:rPr>
+        <w:t xml:space="preserve">기술적</w:t>
+      </w:r>
+      <w:r>
+        <w:t xml:space="preserve"> </w:t>
+      </w:r>
+      <w:r>
+        <w:t xml:space="preserve">기초, 즉 두 단계의 지식이 개별 발명 안에서 결합되고 있다는 사실이다. 융합 이론의 단계 논리(Hacklin et al., 2009)를 따르면 후자가 전자에 선행하며, 따라서 경계를 넘는 특허의 분포는 산업 아키텍처가 어디서 어떻게 재편될지를 조직적 변화보다 앞서 알려주는 선행 지표가 될 수 있다.</w:t>
       </w:r>
     </w:p>
     <w:p>
@@ -4769,7 +4909,7 @@
         <w:t xml:space="preserve"> </w:t>
       </w:r>
       <w:r>
-        <w:t xml:space="preserve">네 번째 함의는 특허 수준 결과를 전략 문헌과 연결한다. 관할권 대비는 공정 단독형 갈래에 집중되어 있으며 제2.4절에서 제시한 해석과 부합한다. 중국 출원청 출원은 범위가 좁고 공정 단독형에 편중되어 있다. 이는 통합된 적층 전체를 청구하기 전에 특정 제조 단계를 내재화하는 추격 자세의 프로필이며(Lee and Lim, 2001), 중국 특허의 양적 팽창이 보조금과 추격 동학에 의해 형성되어 왔다는 증거(Hu and Jefferson, 2009; Dang and Motohashi, 2015)와도 부합한다. 일본 출원청 출원은 넓고 사실상 공정 단독형이 없다. 이는 단일 단계 주변이 아니라 전체 공정 흐름에 걸쳐 특허를 내는 장비·소재 공급사의 강점(Langlois and Steinmueller, 1999) 및 1988년 개혁 이후의 다항 청구 관행(Sakakibara and Branstetter, 2001)과 부합한다. 한국과 대만은 범위와 통합형 갈래에서 미국 기준과 유사한데, 이는 미국 출원인과 정면으로 경쟁하는 메모리 제조사와 파운드리의 위치에 부합한다. 이들의 높은 공정 단독형 경향(대만은 10% 수준에서 유의)은 선도 파운드리가 첨단 패키징 플랫폼을 내재화하며 전공정 역량을 접합 공정에 투입해 온 산업계의 움직임(Lau, 2022; Yole Group, 2024)과 부합한다. 종합하면 이러한 패턴은 누가 어느 단계를 어디에서 점유하는가라는 산업</w:t>
+        <w:t xml:space="preserve">네 번째 함의는 특허 수준 결과를 전략 문헌과 연결하되, 관할권 변수가 출원청이지 출원인 국적이 아니라는 제4.2절의 단서 안에서 읽어야 한다. 관할권 대비는 공정 단독형 갈래에 집중되어 있으며 제2.4절에서 제시한 해석과 부합한다. 중국 출원청 출원은 범위가 좁고 공정 단독형에 편중되어 있다. 이는 통합된 적층 전체를 청구하기 전에 특정 제조 단계를 내재화하는 추격 자세의 프로필과 부합하며(Lee and Lim, 2001), 중국 특허의 양적 팽창이 보조금과 추격 동학에 의해 형성되어 왔다는 증거(Hu and Jefferson, 2009; Dang and Motohashi, 2015)와도 일관된다. 다만 이는 결과와 부합하는 한 가지 해석이다. 중국 출원청에는 외국 기업이 중국 시장 보호를 위해 제출한 2차 출원이 다수 포함되며, 이러한 패밀리 구성원 출원은 통상 원출원보다 범위가 좁게 정리되므로, 좁고 공정 단독형인 프로필의 일부는 외국 출원인의 방어적 출원 관행과 중국 심사 관행에서 비롯되었을 수 있다. 두 해석을 가르려면 출원인 국적 또는 우선권 출원청 기준의 재추정이 필요하다(제6.3절). 일본 출원청 출원은 넓고 사실상 공정 단독형이 없다. 이는 단일 단계 주변이 아니라 전체 공정 흐름에 걸쳐 특허를 내는 장비·소재 공급사의 강점(Langlois and Steinmueller, 1999) 및 1988년 개혁 이후의 다항 청구 관행(Sakakibara and Branstetter, 2001)과 부합한다. 한국과 대만은 범위와 통합형 갈래에서 미국 기준과 유사한데, 이는 미국 출원인과 정면으로 경쟁하는 메모리 제조사와 파운드리의 위치에 부합한다. 이들의 높은 공정 단독형 경향(대만은 10% 수준에서 유의)은 선도 파운드리가 첨단 패키징 플랫폼을 내재화하며 전공정 역량을 접합 공정에 투입해 온 산업계의 움직임(Lau, 2022; Yole Group, 2024)과 부합한다. 종합하면 이러한 패턴은 누가 어느 단계를 어디에서 점유하는가라는 산업</w:t>
       </w:r>
       <w:r>
         <w:t xml:space="preserve"> </w:t>
@@ -4835,7 +4975,7 @@
         <w:pStyle w:val="BodyText"/>
       </w:pPr>
       <w:r>
-        <w:t xml:space="preserve">정책에 대해서는 관할권 대비가 시사적이다. 중국 출원청 프로필은 단계별로 진행되는 추격 전략을 보여준다. 이는 제조 역량의 내재화에는 효과적이지만 통합형 청구를 타국 출원인에게 남겨 둔다. 특허 건수를 보상하는 산업정책(Dang and Motohashi, 2015)은 이 패턴을 강화할 것이다. 메모리 제조사가 차세대 HBM을 위해 하이브리드 본딩에 의존하는 한국에 대해 결과는, 패키징 경쟁력이 패키징 노하우만이 아니라 평탄화, 표면 화학, 정렬 계측 등 전공정 역량과 이를 통합형 청구로 결합하는 능력에 의해 결정될 것임을 함의한다.</w:t>
+        <w:t xml:space="preserve">정책에 대해서는 관할권 대비가 시사적이다. 중국 출원청 프로필은, 추격 해석을 취할 경우, 단계별로 진행되는 추격 전략과 부합한다. 이러한 전략은 제조 역량의 내재화에는 효과적이지만 통합형 청구를 타국 출원인에게 남겨 둔다. 특허 건수를 보상하는 산업정책(Dang and Motohashi, 2015)은 이 패턴을 강화할 것이다. 한국 출원청 계수는 어느 모형에서도 유의하지 않으므로, 한국에 대한 함의는 한국 고유의 효과가 아니라 표본 전체의 패턴에서 추론한 것이다. 메모리 제조사가 차세대 HBM을 위해 하이브리드 본딩에 의존하는 한국에 대해 결과는, 패키징 경쟁력이 패키징 노하우만이 아니라 평탄화, 표면 화학, 정렬 계측 등 전공정 역량과 이를 통합형 청구로 결합하는 능력에 의해 결정될 것임을 함의한다.</w:t>
       </w:r>
     </w:p>
     <w:bookmarkEnd w:id="40"/>
@@ -4853,7 +4993,7 @@
         <w:pStyle w:val="FirstParagraph"/>
       </w:pPr>
       <w:r>
-        <w:t xml:space="preserve">본 연구는 네 가지 한계를 갖는다. 첫째, 관할권 변수는 출원청이지 출원인의 국적이 아니다. 출원청 간 차이는 발명의 기원과 보호 전략을 섞는다. 출원을 출원인 식별자와 본사 위치에 연결하면 둘을 분리하고 기업 고정효과를 넣을 수 있으며, 이는 본 연구의 모든 비교를 보다 정밀하게 할 것이다. 둘째, 추정치는 연관적이다. 범위와 전략은 공동 결정될 개연성이 있고, 데이터에 신뢰할 만한 도구변수가 없어 인과 식별을 시도하지 않는다. 셋째, 융합 신호는 CPC 공동분류로, 결정론적이고 재현 가능하지만 발명에 뒤처진다. 텍스트 기반 방법(Preschitschek et al., 2013; Zhu and Motohashi, 2022)은 심사관이 전공정 코드를 부여하기 전에 경계 넘기를 탐지할 수 있으나 학습된 모형에 의존한다는 비용이 따른다. H01L21과 H01L24의 경계가 제도적으로 명확한 본 연구의 설정에서는 재현가능성이 더 큰 미덕이라고 판단하였다. 경계가 덜 코드화된 설정에서는 이 상충관계가 반대로 작동할 수 있다. 넷째, 각 출원이 CPC 기호의 집합이라는 점에서 특허의 공동분류 구조는 다대다이며, 본 연구의 이항·삼분 부호화는 그 구조를 단일 경계로 투영한다. 고차 공출현을 보존하는 하이퍼그래프 표현과 Trajtenberg et al.(1997) 및 Petralia(2020) 전통의 일반성(generality) 지수는 하이브리드 본딩이 로직·메모리·이미지센서·전력소자로 확산되는 데서 시사되는 범용기술적 성격을 직접 검정할 수 있게 할 것이다(Bresnahan and Trajtenberg, 1995; Hall and Trajtenberg, 2004 참조).</w:t>
+        <w:t xml:space="preserve">본 연구는 네 가지 한계를 갖는다. 첫째, 관할권 변수는 출원청이지 출원인의 국적이 아니다. 출원청 간 차이는 발명의 기원과 보호 전략을 섞는다. 출원을 출원인 식별자와 본사 위치에 연결하면 둘을 분리하고 기업 고정효과를 넣을 수 있으며, 이는 본 연구의 모든 비교를 보다 정밀하게 할 것이다. 둘째, 추정치는 연관적이다. 범위와 전략은 공동 결정될 개연성이 있고, 데이터에 신뢰할 만한 도구변수가 없어 인과 식별을 시도하지 않는다. 특히 기술범위와 통합형 사이의 연관에는 구성상의 요소가 있다. 통합형은 정의상 H01L21과 H01L24를 모두 보유하므로 기술범위가 2 이상이며, 두 클래스를 제외한 기술범위로 재추정하여 이 기계적 성분을 분리하는 것이 후속 과제다. 또한 공정 단독형의 시간적 감소가 분류 관행의 변화를 반영할 가능성(제5.4절)은 2010년 이후 하위표본과 기간 더미를 이용한 재추정, 그리고 기간별 세 유형 비중의 직접 비교로 점검할 필요가 있다. 셋째, 융합 신호는 CPC 공동분류로, 결정론적이고 재현 가능하지만 발명에 뒤처진다. 텍스트 기반 방법(Preschitschek et al., 2013; Zhu and Motohashi, 2022)은 심사관이 전공정 코드를 부여하기 전에 경계 넘기를 탐지할 수 있으나 학습된 모형에 의존한다는 비용이 따른다. H01L21과 H01L24의 경계가 제도적으로 명확한 본 연구의 설정에서는 재현가능성이 더 큰 미덕이라고 판단하였다. 경계가 덜 코드화된 설정에서는 이 상충관계가 반대로 작동할 수 있다. 넷째, 각 출원이 CPC 기호의 집합이라는 점에서 특허의 공동분류 구조는 다대다이며, 본 연구의 이항·삼분 부호화는 그 구조를 단일 경계로 투영한다. 고차 공출현을 보존하는 하이퍼그래프 표현과 Trajtenberg et al.(1997) 및 Petralia(2020) 전통의 일반성(generality) 지수는 하이브리드 본딩이 로직·메모리·이미지센서·전력소자로 확산되는 데서 시사되는 범용기술적 성격을 직접 검정할 수 있게 할 것이다(Bresnahan and Trajtenberg, 1995; Hall and Trajtenberg, 2004 참조).</w:t>
       </w:r>
     </w:p>
     <w:p>
@@ -4880,7 +5020,7 @@
         <w:pStyle w:val="FirstParagraph"/>
       </w:pPr>
       <w:r>
-        <w:t xml:space="preserve">기술융합은 그동안 거의 전적으로 산업 간의 만남으로 연구되어 왔다. 본 연구는 융합이 한 산업의 가치사슬 단계들을 가로질러서도 일어나며, 개별 특허의 청구항에서 관찰될 수 있고, 그 결정요인이 추정될 수 있음을 보였다. 성능이 전공정 역량에 달린 후공정 공정인 하이브리드 본딩에서, 특허출원의 거의 3분의 2가 제조공정 기술을 청구하며 최빈 발명은 두 단계를 통합한다. 경계 넘기는 기술범위와 강하게 연관되고, 시간이 갈수록 경계를 넘는 청구의 단조 증가가 아니라 순수 전공정 청구가 통합형 청구로 대체되는 재구성을 통해 진행되었으며, 산업 아키텍처와 추격의 흔적을 지닌다. 중국 출원청 출원은 좁고 공정 지향적이며, 일본 출원청 출원은 넓고 통합 지향적이다. 오랫동안 분리되어 있던 전공정과 후공정은 발명의 기록 속에서 수렴하고 있으며, 그 수렴의 구조는 산업 내 사례로 확장되고 산업 아키텍처 문헌과 결합된 융합 이론으로 설명할 수 있다.</w:t>
+        <w:t xml:space="preserve">기술융합은 그동안 거의 전적으로 산업 간의 만남으로 연구되어 왔다. 본 연구는 융합이 한 산업의 가치사슬 단계들을 가로질러서도 일어나며, 개별 특허의 청구항에서 관찰될 수 있고, 그 결정요인이 추정될 수 있음을 보였다. 성능이 전공정 역량에 달린 후공정 공정인 하이브리드 본딩에서, 최빈 발명은 두 단계를 한 발명 안에 통합하는 유형(45.8%)이며 제조공정 기술을 청구하는 출원은 63.6%에 이른다. 경계 넘기는 기술범위와 강하게 연관되고, 시간이 갈수록 경계를 넘는 청구의 단조 증가가 아니라 순수 전공정 청구가 통합형 청구로 대체되는 재구성을 통해 진행되었으며, 산업 아키텍처와 추격의 흔적을 지닌다. 중국 출원청 출원은 좁고 공정 지향적이며, 일본 출원청 출원은 넓고 통합 지향적이다. 오랫동안 분리되어 있던 전공정과 후공정은 발명의 기록 속에서 수렴하고 있으며, 그 수렴의 구조는 산업 내 사례로 확장되고 산업 아키텍처 문헌과 결합된 융합 이론으로 설명할 수 있다.</w:t>
       </w:r>
     </w:p>
     <w:p>

</xml_diff>